<commit_message>
test(export): record that a taller paragraph mark grows no line in Word (#949)
Word for the web's PDF of 10 pt Calibri runs under a 20 pt mark (new
CASE8, single, and CASE9, 1.15), each followed by a plain 10 pt
paragraph, steps every line, the last included, by an ordinary 10 pt
line. The converter already matches because its strut comes from the
runs (#940); the new spec case guards it.
</commit_message>
<xml_diff>
--- a/npm/tests/fixtures/line-baselines.docx
+++ b/npm/tests/fixtures/line-baselines.docx
@@ -233,6 +233,96 @@
           <w:szCs w:val="22"/>
         </w:rPr>
         <w:t xml:space="preserve"> The quick brown fox jumps over the lazy dog while the editor counts every line. The quick brown fox jumps over the lazy dog while the editor counts every line. The quick brown fox jumps over the lazy dog while the editor counts every line. The quick brown fox jumps over the lazy dog while the editor counts every line. </w:t>
+      </w:r>
+    </w:p>
+    <w:p>
+      <w:pPr>
+        <w:pageBreakBefore/>
+        <w:spacing w:before="0" w:after="0" w:line="240" w:lineRule="auto"/>
+        <w:rPr>
+          <w:rFonts w:ascii="Calibri" w:hAnsi="Calibri" w:cs="Calibri"/>
+          <w:sz w:val="40"/>
+          <w:szCs w:val="40"/>
+        </w:rPr>
+      </w:pPr>
+      <w:r>
+        <w:rPr>
+          <w:rFonts w:ascii="Calibri" w:hAnsi="Calibri" w:cs="Calibri"/>
+          <w:sz w:val="20"/>
+          <w:szCs w:val="20"/>
+        </w:rPr>
+        <w:t xml:space="preserve">CASE8 </w:t>
+      </w:r>
+      <w:r>
+        <w:rPr>
+          <w:rFonts w:ascii="Calibri" w:hAnsi="Calibri" w:cs="Calibri"/>
+          <w:sz w:val="20"/>
+          <w:szCs w:val="20"/>
+        </w:rPr>
+        <w:t xml:space="preserve">The quick brown fox jumps over the lazy dog while the editor counts every line. The quick brown fox jumps over the lazy dog while the editor counts every line. The quick brown fox jumps over the lazy dog while the editor counts every line. The quick brown fox jumps over the lazy dog while the editor counts every line. </w:t>
+      </w:r>
+    </w:p>
+    <w:p>
+      <w:pPr>
+        <w:spacing w:before="0" w:after="0" w:line="240" w:lineRule="auto"/>
+        <w:rPr>
+          <w:rFonts w:ascii="Calibri" w:hAnsi="Calibri" w:cs="Calibri"/>
+          <w:sz w:val="20"/>
+          <w:szCs w:val="20"/>
+        </w:rPr>
+      </w:pPr>
+      <w:r>
+        <w:rPr>
+          <w:rFonts w:ascii="Calibri" w:hAnsi="Calibri" w:cs="Calibri"/>
+          <w:sz w:val="20"/>
+          <w:szCs w:val="20"/>
+        </w:rPr>
+        <w:t xml:space="preserve">AFTER8 The quick brown fox jumps over the lazy dog while the editor counts every line. </w:t>
+      </w:r>
+    </w:p>
+    <w:p>
+      <w:pPr>
+        <w:pageBreakBefore/>
+        <w:spacing w:before="0" w:after="0" w:line="276" w:lineRule="auto"/>
+        <w:rPr>
+          <w:rFonts w:ascii="Calibri" w:hAnsi="Calibri" w:cs="Calibri"/>
+          <w:sz w:val="40"/>
+          <w:szCs w:val="40"/>
+        </w:rPr>
+      </w:pPr>
+      <w:r>
+        <w:rPr>
+          <w:rFonts w:ascii="Calibri" w:hAnsi="Calibri" w:cs="Calibri"/>
+          <w:sz w:val="20"/>
+          <w:szCs w:val="20"/>
+        </w:rPr>
+        <w:t xml:space="preserve">CASE9 </w:t>
+      </w:r>
+      <w:r>
+        <w:rPr>
+          <w:rFonts w:ascii="Calibri" w:hAnsi="Calibri" w:cs="Calibri"/>
+          <w:sz w:val="20"/>
+          <w:szCs w:val="20"/>
+        </w:rPr>
+        <w:t xml:space="preserve">The quick brown fox jumps over the lazy dog while the editor counts every line. The quick brown fox jumps over the lazy dog while the editor counts every line. The quick brown fox jumps over the lazy dog while the editor counts every line. The quick brown fox jumps over the lazy dog while the editor counts every line. </w:t>
+      </w:r>
+    </w:p>
+    <w:p>
+      <w:pPr>
+        <w:spacing w:before="0" w:after="0" w:line="276" w:lineRule="auto"/>
+        <w:rPr>
+          <w:rFonts w:ascii="Calibri" w:hAnsi="Calibri" w:cs="Calibri"/>
+          <w:sz w:val="20"/>
+          <w:szCs w:val="20"/>
+        </w:rPr>
+      </w:pPr>
+      <w:r>
+        <w:rPr>
+          <w:rFonts w:ascii="Calibri" w:hAnsi="Calibri" w:cs="Calibri"/>
+          <w:sz w:val="20"/>
+          <w:szCs w:val="20"/>
+        </w:rPr>
+        <w:t xml:space="preserve">AFTER9 The quick brown fox jumps over the lazy dog while the editor counts every line. </w:t>
       </w:r>
     </w:p>
     <w:sectPr>

</xml_diff>

<commit_message>
test(export): record that a taller paragraph mark grows no line in Word (#949) (#953)
Word for the web's PDF of 10 pt Calibri runs under a 20 pt mark (new
CASE8, single, and CASE9, 1.15), each followed by a plain 10 pt
paragraph, steps every line, the last included, by an ordinary 10 pt
line. The converter already matches because its strut comes from the
runs (#940); the new spec case guards it.
</commit_message>
<xml_diff>
--- a/npm/tests/fixtures/line-baselines.docx
+++ b/npm/tests/fixtures/line-baselines.docx
@@ -233,6 +233,96 @@
           <w:szCs w:val="22"/>
         </w:rPr>
         <w:t xml:space="preserve"> The quick brown fox jumps over the lazy dog while the editor counts every line. The quick brown fox jumps over the lazy dog while the editor counts every line. The quick brown fox jumps over the lazy dog while the editor counts every line. The quick brown fox jumps over the lazy dog while the editor counts every line. </w:t>
+      </w:r>
+    </w:p>
+    <w:p>
+      <w:pPr>
+        <w:pageBreakBefore/>
+        <w:spacing w:before="0" w:after="0" w:line="240" w:lineRule="auto"/>
+        <w:rPr>
+          <w:rFonts w:ascii="Calibri" w:hAnsi="Calibri" w:cs="Calibri"/>
+          <w:sz w:val="40"/>
+          <w:szCs w:val="40"/>
+        </w:rPr>
+      </w:pPr>
+      <w:r>
+        <w:rPr>
+          <w:rFonts w:ascii="Calibri" w:hAnsi="Calibri" w:cs="Calibri"/>
+          <w:sz w:val="20"/>
+          <w:szCs w:val="20"/>
+        </w:rPr>
+        <w:t xml:space="preserve">CASE8 </w:t>
+      </w:r>
+      <w:r>
+        <w:rPr>
+          <w:rFonts w:ascii="Calibri" w:hAnsi="Calibri" w:cs="Calibri"/>
+          <w:sz w:val="20"/>
+          <w:szCs w:val="20"/>
+        </w:rPr>
+        <w:t xml:space="preserve">The quick brown fox jumps over the lazy dog while the editor counts every line. The quick brown fox jumps over the lazy dog while the editor counts every line. The quick brown fox jumps over the lazy dog while the editor counts every line. The quick brown fox jumps over the lazy dog while the editor counts every line. </w:t>
+      </w:r>
+    </w:p>
+    <w:p>
+      <w:pPr>
+        <w:spacing w:before="0" w:after="0" w:line="240" w:lineRule="auto"/>
+        <w:rPr>
+          <w:rFonts w:ascii="Calibri" w:hAnsi="Calibri" w:cs="Calibri"/>
+          <w:sz w:val="20"/>
+          <w:szCs w:val="20"/>
+        </w:rPr>
+      </w:pPr>
+      <w:r>
+        <w:rPr>
+          <w:rFonts w:ascii="Calibri" w:hAnsi="Calibri" w:cs="Calibri"/>
+          <w:sz w:val="20"/>
+          <w:szCs w:val="20"/>
+        </w:rPr>
+        <w:t xml:space="preserve">AFTER8 The quick brown fox jumps over the lazy dog while the editor counts every line. </w:t>
+      </w:r>
+    </w:p>
+    <w:p>
+      <w:pPr>
+        <w:pageBreakBefore/>
+        <w:spacing w:before="0" w:after="0" w:line="276" w:lineRule="auto"/>
+        <w:rPr>
+          <w:rFonts w:ascii="Calibri" w:hAnsi="Calibri" w:cs="Calibri"/>
+          <w:sz w:val="40"/>
+          <w:szCs w:val="40"/>
+        </w:rPr>
+      </w:pPr>
+      <w:r>
+        <w:rPr>
+          <w:rFonts w:ascii="Calibri" w:hAnsi="Calibri" w:cs="Calibri"/>
+          <w:sz w:val="20"/>
+          <w:szCs w:val="20"/>
+        </w:rPr>
+        <w:t xml:space="preserve">CASE9 </w:t>
+      </w:r>
+      <w:r>
+        <w:rPr>
+          <w:rFonts w:ascii="Calibri" w:hAnsi="Calibri" w:cs="Calibri"/>
+          <w:sz w:val="20"/>
+          <w:szCs w:val="20"/>
+        </w:rPr>
+        <w:t xml:space="preserve">The quick brown fox jumps over the lazy dog while the editor counts every line. The quick brown fox jumps over the lazy dog while the editor counts every line. The quick brown fox jumps over the lazy dog while the editor counts every line. The quick brown fox jumps over the lazy dog while the editor counts every line. </w:t>
+      </w:r>
+    </w:p>
+    <w:p>
+      <w:pPr>
+        <w:spacing w:before="0" w:after="0" w:line="276" w:lineRule="auto"/>
+        <w:rPr>
+          <w:rFonts w:ascii="Calibri" w:hAnsi="Calibri" w:cs="Calibri"/>
+          <w:sz w:val="20"/>
+          <w:szCs w:val="20"/>
+        </w:rPr>
+      </w:pPr>
+      <w:r>
+        <w:rPr>
+          <w:rFonts w:ascii="Calibri" w:hAnsi="Calibri" w:cs="Calibri"/>
+          <w:sz w:val="20"/>
+          <w:szCs w:val="20"/>
+        </w:rPr>
+        <w:t xml:space="preserve">AFTER9 The quick brown fox jumps over the lazy dog while the editor counts every line. </w:t>
       </w:r>
     </w:p>
     <w:sectPr>

</xml_diff>